<commit_message>
doc(warehouse): [SCRUM6] Sua lai file bao cao ve BI, ML mart
</commit_message>
<xml_diff>
--- a/docs/scrum_5_pipeline_foundation/2026_06_16_BÁO_CÁO_TỔNG_QUAN_HỆ_THỐNG_DATA_MART_By_Toàn.docx
+++ b/docs/scrum_5_pipeline_foundation/2026_06_16_BÁO_CÁO_TỔNG_QUAN_HỆ_THỐNG_DATA_MART_By_Toàn.docx
@@ -15,7 +15,7 @@
           <w:szCs w:val="46"/>
         </w:rPr>
       </w:pPr>
-      <w:bookmarkStart w:colFirst="0" w:colLast="0" w:name="_xez2m7lscu1x" w:id="0"/>
+      <w:bookmarkStart w:colFirst="0" w:colLast="0" w:name="_b9tm65b97xph" w:id="0"/>
       <w:bookmarkEnd w:id="0"/>
       <w:r>
         <w:rPr>
@@ -62,7 +62,8 @@
         <w:pStyle w:val="Heading2"/>
         <w:keepNext w:val="0"/>
         <w:keepLines w:val="0"/>
-        <w:spacing w:after="80" w:before="0" w:lineRule="auto"/>
+        <w:spacing w:after="80" w:lineRule="auto"/>
+        <w:ind w:left="720" w:hanging="360"/>
         <w:rPr>
           <w:b w:val="1"/>
           <w:bCs w:val="1"/>
@@ -70,7 +71,7 @@
           <w:szCs w:val="34"/>
         </w:rPr>
       </w:pPr>
-      <w:bookmarkStart w:colFirst="0" w:colLast="0" w:name="_mebqgf8vdv29" w:id="1"/>
+      <w:bookmarkStart w:colFirst="0" w:colLast="0" w:name="_3f00nma5y9z" w:id="1"/>
       <w:bookmarkEnd w:id="1"/>
       <w:r>
         <w:rPr>
@@ -80,12 +81,12 @@
           <w:szCs w:val="34"/>
           <w:rtl w:val="0"/>
         </w:rPr>
-        <w:t xml:space="preserve">I. TỔNG QUAN PIPELINE</w:t>
-      </w:r>
-    </w:p>
-    <w:p>
-      <w:pPr>
-        <w:spacing w:after="240" w:lineRule="auto"/>
+        <w:t xml:space="preserve">I. TỔNG QUAN KIẾN TRÚC PIPELINE</w:t>
+      </w:r>
+    </w:p>
+    <w:p>
+      <w:pPr>
+        <w:spacing w:after="240" w:before="240" w:lineRule="auto"/>
         <w:rPr/>
       </w:pPr>
       <w:r>
@@ -96,19 +97,21 @@
       </w:r>
       <w:r>
         <w:rPr>
-          <w:color w:val="188038"/>
-          <w:rtl w:val="0"/>
-        </w:rPr>
-        <w:t xml:space="preserve">Schema_BI_ML_mart.py</w:t>
-      </w:r>
-      <w:r>
-        <w:rPr>
-          <w:rtl w:val="0"/>
-        </w:rPr>
-        <w:t xml:space="preserve"> đóng vai trò là tầng Transform &amp; Load (T&amp;L) cuối cùng trong kiến trúc tổng thể. File sử dụng thư viện kết nối hiệu năng cao </w:t>
-      </w:r>
-      <w:r>
-        <w:rPr>
+          <w:rFonts w:ascii="Roboto Mono" w:cs="Roboto Mono" w:eastAsia="Roboto Mono" w:hAnsi="Roboto Mono"/>
+          <w:color w:val="188038"/>
+          <w:rtl w:val="0"/>
+        </w:rPr>
+        <w:t xml:space="preserve">build_data_marts.py</w:t>
+      </w:r>
+      <w:r>
+        <w:rPr>
+          <w:rtl w:val="0"/>
+        </w:rPr>
+        <w:t xml:space="preserve"> đảm nhiệm vai trò là tầng Transform &amp; Load (T&amp;L) trong hệ thống Data Warehouse. Pipeline sử dụng thư viện </w:t>
+      </w:r>
+      <w:r>
+        <w:rPr>
+          <w:rFonts w:ascii="Roboto Mono" w:cs="Roboto Mono" w:eastAsia="Roboto Mono" w:hAnsi="Roboto Mono"/>
           <w:color w:val="188038"/>
           <w:rtl w:val="0"/>
         </w:rPr>
@@ -122,6 +125,7 @@
       </w:r>
       <w:r>
         <w:rPr>
+          <w:rFonts w:ascii="Roboto Mono" w:cs="Roboto Mono" w:eastAsia="Roboto Mono" w:hAnsi="Roboto Mono"/>
           <w:color w:val="188038"/>
           <w:rtl w:val="0"/>
         </w:rPr>
@@ -131,28 +135,28 @@
         <w:rPr>
           <w:rtl w:val="0"/>
         </w:rPr>
-        <w:t xml:space="preserve"> để kết nối trực tiếp với Cloud Database (Supabase).</w:t>
-      </w:r>
-    </w:p>
-    <w:p>
-      <w:pPr>
-        <w:spacing w:after="240" w:lineRule="auto"/>
+        <w:t xml:space="preserve"> để giao tiếp an toàn với Cloud Database (Supabase).</w:t>
+      </w:r>
+    </w:p>
+    <w:p>
+      <w:pPr>
+        <w:spacing w:after="240" w:before="240" w:lineRule="auto"/>
         <w:rPr/>
       </w:pPr>
       <w:r>
         <w:rPr>
           <w:rtl w:val="0"/>
         </w:rPr>
-        <w:t xml:space="preserve">Cơ chế vận hành: Hệ thống áp dụng phương thức Full Refresh (Drop &amp; Create). Mỗi lần pipeline kích hoạt, các bảng cũ sẽ được dọn dẹp triệt để và tái cấu trúc hoàn toàn mới. Cơ chế này đem lại hai lợi thế lớn trong giai đoạn phát triển:</w:t>
+        <w:t xml:space="preserve">Cơ chế vận hành (Full Refresh): Hệ thống áp dụng phương thức Drop &amp; Create (Xóa và Tạo lại) mỗi khi 파peline được kích hoạt. Lựa chọn này mang lại hai ưu điểm vượt trội:</w:t>
       </w:r>
     </w:p>
     <w:p>
       <w:pPr>
         <w:numPr>
           <w:ilvl w:val="0"/>
-          <w:numId w:val="3"/>
+          <w:numId w:val="4"/>
         </w:numPr>
-        <w:spacing w:after="0" w:afterAutospacing="0" w:lineRule="auto"/>
+        <w:spacing w:after="0" w:afterAutospacing="0" w:before="240" w:lineRule="auto"/>
         <w:ind w:left="720" w:hanging="360"/>
         <w:rPr/>
       </w:pPr>
@@ -160,16 +164,16 @@
         <w:rPr>
           <w:rtl w:val="0"/>
         </w:rPr>
-        <w:t xml:space="preserve">Tránh trùng lặp (Zero Duplication): Dữ liệu không bao giờ bị cộng dồn hay nhân bản.</w:t>
+        <w:t xml:space="preserve">Tránh trùng lặp (Zero Duplication): Dữ liệu không bao giờ bị nhân bản do chạy lại kịch bản.</w:t>
       </w:r>
     </w:p>
     <w:p>
       <w:pPr>
         <w:numPr>
           <w:ilvl w:val="0"/>
-          <w:numId w:val="3"/>
+          <w:numId w:val="4"/>
         </w:numPr>
-        <w:spacing w:after="240" w:lineRule="auto"/>
+        <w:spacing w:after="240" w:before="0" w:beforeAutospacing="0" w:lineRule="auto"/>
         <w:ind w:left="720" w:hanging="360"/>
         <w:rPr/>
       </w:pPr>
@@ -177,7 +181,7 @@
         <w:rPr>
           <w:rtl w:val="0"/>
         </w:rPr>
-        <w:t xml:space="preserve">Tiến hóa cấu trúc (Schema Evolution): Cho phép thay đổi, thêm bớt các trường thông tin (features) mà không làm sập hệ thống hoặc phải cấu hình lại bảng bằng tay.</w:t>
+        <w:t xml:space="preserve">Tiến hóa cấu trúc (Schema Evolution): Cho phép Data Scientist tự do thêm/bớt các trường thông tin (features) mà hệ thống dữ liệu tự động thích nghi không cần tái cấu hình thủ công.</w:t>
       </w:r>
     </w:p>
     <w:p>
@@ -185,8 +189,10 @@
         <w:pStyle w:val="Heading2"/>
         <w:keepNext w:val="0"/>
         <w:keepLines w:val="0"/>
-        <w:spacing w:after="80" w:before="0" w:lineRule="auto"/>
-        <w:rPr>
+        <w:spacing w:after="80" w:lineRule="auto"/>
+        <w:ind w:left="720" w:hanging="360"/>
+        <w:rPr>
+          <w:rFonts w:ascii="Roboto Mono" w:cs="Roboto Mono" w:eastAsia="Roboto Mono" w:hAnsi="Roboto Mono"/>
           <w:b w:val="1"/>
           <w:bCs w:val="1"/>
           <w:color w:val="188038"/>
@@ -194,7 +200,7 @@
           <w:szCs w:val="34"/>
         </w:rPr>
       </w:pPr>
-      <w:bookmarkStart w:colFirst="0" w:colLast="0" w:name="_3jsfl8okuhhm" w:id="2"/>
+      <w:bookmarkStart w:colFirst="0" w:colLast="0" w:name="_qs8o5jite7uw" w:id="2"/>
       <w:bookmarkEnd w:id="2"/>
       <w:r>
         <w:rPr>
@@ -204,10 +210,11 @@
           <w:szCs w:val="34"/>
           <w:rtl w:val="0"/>
         </w:rPr>
-        <w:t xml:space="preserve">II. CẤU TRÚC VÀ CÔNG DỤNG CÁC BẢNG TRONG </w:t>
-      </w:r>
-      <w:r>
-        <w:rPr>
+        <w:t xml:space="preserve">II. PHÂN HỆ BÁO CÁO: </w:t>
+      </w:r>
+      <w:r>
+        <w:rPr>
+          <w:rFonts w:ascii="Roboto Mono" w:cs="Roboto Mono" w:eastAsia="Roboto Mono" w:hAnsi="Roboto Mono"/>
           <w:b w:val="1"/>
           <w:bCs w:val="1"/>
           <w:color w:val="188038"/>
@@ -220,7 +227,7 @@
     </w:p>
     <w:p>
       <w:pPr>
-        <w:spacing w:after="240" w:lineRule="auto"/>
+        <w:spacing w:after="240" w:before="240" w:lineRule="auto"/>
         <w:rPr/>
       </w:pPr>
       <w:r>
@@ -231,6 +238,7 @@
       </w:r>
       <w:r>
         <w:rPr>
+          <w:rFonts w:ascii="Roboto Mono" w:cs="Roboto Mono" w:eastAsia="Roboto Mono" w:hAnsi="Roboto Mono"/>
           <w:color w:val="188038"/>
           <w:rtl w:val="0"/>
         </w:rPr>
@@ -240,21 +248,7 @@
         <w:rPr>
           <w:rtl w:val="0"/>
         </w:rPr>
-        <w:t xml:space="preserve"> được thiết kế theo mô hình </w:t>
-      </w:r>
-      <w:r>
-        <w:rPr>
-          <w:b w:val="1"/>
-          <w:bCs w:val="1"/>
-          <w:rtl w:val="0"/>
-        </w:rPr>
-        <w:t xml:space="preserve">Lược đồ Hình sao Vật lý (Physical Star Schema)</w:t>
-      </w:r>
-      <w:r>
-        <w:rPr>
-          <w:rtl w:val="0"/>
-        </w:rPr>
-        <w:t xml:space="preserve"> chuẩn hóa nhằm tối ưu hóa triệt để cho công cụ kéo thả báo cáo (Tableau/Power BI).</w:t>
+        <w:t xml:space="preserve"> được thiết kế theo mô hình Lược đồ Hình sao Vật lý (Physical Star Schema)  nhằm tối ưu hóa triệt để tốc độ truy vấn cho công cụ BI (Tableau/Power BI).</w:t>
       </w:r>
     </w:p>
     <w:p>
@@ -262,8 +256,10 @@
         <w:pStyle w:val="Heading3"/>
         <w:keepNext w:val="0"/>
         <w:keepLines w:val="0"/>
-        <w:spacing w:before="0" w:lineRule="auto"/>
-        <w:rPr>
+        <w:spacing w:before="280" w:lineRule="auto"/>
+        <w:ind w:left="720" w:hanging="360"/>
+        <w:rPr>
+          <w:rFonts w:ascii="Roboto Mono" w:cs="Roboto Mono" w:eastAsia="Roboto Mono" w:hAnsi="Roboto Mono"/>
           <w:b w:val="1"/>
           <w:bCs w:val="1"/>
           <w:color w:val="188038"/>
@@ -271,7 +267,7 @@
           <w:szCs w:val="26"/>
         </w:rPr>
       </w:pPr>
-      <w:bookmarkStart w:colFirst="0" w:colLast="0" w:name="_1btwq39txwy3" w:id="3"/>
+      <w:bookmarkStart w:colFirst="0" w:colLast="0" w:name="_orkpk22nelyp" w:id="3"/>
       <w:bookmarkEnd w:id="3"/>
       <w:r>
         <w:rPr>
@@ -282,10 +278,11 @@
           <w:szCs w:val="26"/>
           <w:rtl w:val="0"/>
         </w:rPr>
-        <w:t xml:space="preserve">1. Bảng Fact Trung Tâm: </w:t>
-      </w:r>
-      <w:r>
-        <w:rPr>
+        <w:t xml:space="preserve">1. Bảng Sự kiện Trung tâm: </w:t>
+      </w:r>
+      <w:r>
+        <w:rPr>
+          <w:rFonts w:ascii="Roboto Mono" w:cs="Roboto Mono" w:eastAsia="Roboto Mono" w:hAnsi="Roboto Mono"/>
           <w:b w:val="1"/>
           <w:bCs w:val="1"/>
           <w:color w:val="188038"/>
@@ -300,9 +297,9 @@
       <w:pPr>
         <w:numPr>
           <w:ilvl w:val="0"/>
-          <w:numId w:val="2"/>
+          <w:numId w:val="3"/>
         </w:numPr>
-        <w:spacing w:after="0" w:afterAutospacing="0" w:lineRule="auto"/>
+        <w:spacing w:after="0" w:afterAutospacing="0" w:before="240" w:lineRule="auto"/>
         <w:ind w:left="720" w:hanging="360"/>
         <w:rPr/>
       </w:pPr>
@@ -317,9 +314,9 @@
       <w:pPr>
         <w:numPr>
           <w:ilvl w:val="0"/>
-          <w:numId w:val="2"/>
+          <w:numId w:val="3"/>
         </w:numPr>
-        <w:spacing w:after="0" w:afterAutospacing="0" w:lineRule="auto"/>
+        <w:spacing w:after="0" w:afterAutospacing="0" w:before="0" w:beforeAutospacing="0" w:lineRule="auto"/>
         <w:ind w:left="720" w:hanging="360"/>
         <w:rPr/>
       </w:pPr>
@@ -327,36 +324,118 @@
         <w:rPr>
           <w:rtl w:val="0"/>
         </w:rPr>
-        <w:t xml:space="preserve">Quy trình xử lý dữ liệu: Lấy dữ liệu sản lượng 15 phút từ bảng gốc $\rightarrow$ Liên kết với bảng cờ </w:t>
-      </w:r>
-      <w:r>
-        <w:rPr>
-          <w:color w:val="188038"/>
-          <w:rtl w:val="0"/>
-        </w:rPr>
-        <w:t xml:space="preserve">staging</w:t>
-      </w:r>
-      <w:r>
-        <w:rPr>
-          <w:rtl w:val="0"/>
-        </w:rPr>
-        <w:t xml:space="preserve"> để loại bỏ toàn bộ nhiễu cảm biến (</w:t>
-      </w:r>
-      <w:r>
-        <w:rPr>
-          <w:color w:val="188038"/>
-          <w:rtl w:val="0"/>
-        </w:rPr>
-        <w:t xml:space="preserve">rolling_outlier_flag = true</w:t>
-      </w:r>
-      <w:r>
-        <w:rPr>
-          <w:rtl w:val="0"/>
-        </w:rPr>
-        <w:t xml:space="preserve">) $\rightarrow$ Gom nhóm (SUM) 4 dòng 15 phút thành 1 dòng 1 giờ $\rightarrow$ Nối (JOIN) tỷ lệ 1:1 với dữ liệu thời tiết theo đúng tọa độ vùng (</w:t>
-      </w:r>
-      <w:r>
-        <w:rPr>
+        <w:t xml:space="preserve">Quy trình xử lý dữ liệu tối ưu:</w:t>
+      </w:r>
+    </w:p>
+    <w:p>
+      <w:pPr>
+        <w:numPr>
+          <w:ilvl w:val="1"/>
+          <w:numId w:val="3"/>
+        </w:numPr>
+        <w:spacing w:after="0" w:afterAutospacing="0" w:before="0" w:beforeAutospacing="0" w:lineRule="auto"/>
+        <w:ind w:left="1440" w:hanging="360"/>
+      </w:pPr>
+      <w:r>
+        <w:rPr>
+          <w:rtl w:val="0"/>
+        </w:rPr>
+        <w:t xml:space="preserve">Đọc dữ liệu sản lượng 15 phút từ bảng </w:t>
+      </w:r>
+      <w:r>
+        <w:rPr>
+          <w:rFonts w:ascii="Roboto Mono" w:cs="Roboto Mono" w:eastAsia="Roboto Mono" w:hAnsi="Roboto Mono"/>
+          <w:color w:val="188038"/>
+          <w:rtl w:val="0"/>
+        </w:rPr>
+        <w:t xml:space="preserve">public.fact_solar_energy_gen</w:t>
+      </w:r>
+      <w:r>
+        <w:rPr>
+          <w:rtl w:val="0"/>
+        </w:rPr>
+        <w:t xml:space="preserve">.</w:t>
+      </w:r>
+    </w:p>
+    <w:p>
+      <w:pPr>
+        <w:numPr>
+          <w:ilvl w:val="1"/>
+          <w:numId w:val="3"/>
+        </w:numPr>
+        <w:spacing w:after="0" w:afterAutospacing="0" w:before="0" w:beforeAutospacing="0" w:lineRule="auto"/>
+        <w:ind w:left="1440" w:hanging="360"/>
+      </w:pPr>
+      <w:r>
+        <w:rPr>
+          <w:rtl w:val="0"/>
+        </w:rPr>
+        <w:t xml:space="preserve">Lọc nhiễu trực tiếp: Dựa vào cờ </w:t>
+      </w:r>
+      <w:r>
+        <w:rPr>
+          <w:rFonts w:ascii="Roboto Mono" w:cs="Roboto Mono" w:eastAsia="Roboto Mono" w:hAnsi="Roboto Mono"/>
+          <w:color w:val="188038"/>
+          <w:rtl w:val="0"/>
+        </w:rPr>
+        <w:t xml:space="preserve">rolling_outlier_flag</w:t>
+      </w:r>
+      <w:r>
+        <w:rPr>
+          <w:rtl w:val="0"/>
+        </w:rPr>
+        <w:t xml:space="preserve"> đã được tính toán sẵn ở tầng dưới, hệ thống loại bỏ ngay các dòng nhiễu cảm biến mà không cần phải thực hiện các phép </w:t>
+      </w:r>
+      <w:r>
+        <w:rPr>
+          <w:rFonts w:ascii="Roboto Mono" w:cs="Roboto Mono" w:eastAsia="Roboto Mono" w:hAnsi="Roboto Mono"/>
+          <w:color w:val="188038"/>
+          <w:rtl w:val="0"/>
+        </w:rPr>
+        <w:t xml:space="preserve">JOIN</w:t>
+      </w:r>
+      <w:r>
+        <w:rPr>
+          <w:rtl w:val="0"/>
+        </w:rPr>
+        <w:t xml:space="preserve"> chéo sang schema khác.</w:t>
+      </w:r>
+    </w:p>
+    <w:p>
+      <w:pPr>
+        <w:numPr>
+          <w:ilvl w:val="1"/>
+          <w:numId w:val="3"/>
+        </w:numPr>
+        <w:spacing w:after="0" w:afterAutospacing="0" w:before="0" w:beforeAutospacing="0" w:lineRule="auto"/>
+        <w:ind w:left="1440" w:hanging="360"/>
+        <w:rPr/>
+      </w:pPr>
+      <w:r>
+        <w:rPr>
+          <w:rtl w:val="0"/>
+        </w:rPr>
+        <w:t xml:space="preserve">Gom nhóm (SUM) 4 dòng 15 phút thành 1 dòng 1 giờ.</w:t>
+      </w:r>
+    </w:p>
+    <w:p>
+      <w:pPr>
+        <w:numPr>
+          <w:ilvl w:val="1"/>
+          <w:numId w:val="3"/>
+        </w:numPr>
+        <w:spacing w:after="0" w:afterAutospacing="0" w:before="0" w:beforeAutospacing="0" w:lineRule="auto"/>
+        <w:ind w:left="1440" w:hanging="360"/>
+      </w:pPr>
+      <w:r>
+        <w:rPr>
+          <w:rtl w:val="0"/>
+        </w:rPr>
+        <w:t xml:space="preserve">Ghép nối 1:1 với dữ liệu thời tiết (bức xạ, nhiệt độ) dựa trên tọa độ </w:t>
+      </w:r>
+      <w:r>
+        <w:rPr>
+          <w:rFonts w:ascii="Roboto Mono" w:cs="Roboto Mono" w:eastAsia="Roboto Mono" w:hAnsi="Roboto Mono"/>
           <w:color w:val="188038"/>
           <w:rtl w:val="0"/>
         </w:rPr>
@@ -366,44 +445,27 @@
         <w:rPr>
           <w:rtl w:val="0"/>
         </w:rPr>
-        <w:t xml:space="preserve">) và thời gian.</w:t>
+        <w:t xml:space="preserve"> và mốc thời gian.</w:t>
       </w:r>
     </w:p>
     <w:p>
       <w:pPr>
         <w:numPr>
           <w:ilvl w:val="0"/>
-          <w:numId w:val="2"/>
+          <w:numId w:val="3"/>
         </w:numPr>
-        <w:spacing w:after="0" w:afterAutospacing="0" w:lineRule="auto"/>
-        <w:ind w:left="720" w:hanging="360"/>
-        <w:rPr/>
-      </w:pPr>
-      <w:r>
-        <w:rPr>
-          <w:rtl w:val="0"/>
-        </w:rPr>
-        <w:t xml:space="preserve">Công dụng: Là nguồn dữ liệu duy nhất cung cấp cho các Dashboard Tableau. Bảng này giúp báo cáo tính toán chính xác mối tương quan giữa các chỉ số thời tiết (nhiệt độ, bức xạ) và hiệu suất trạm điện mà không sợ sai lệch số liệu hay dính dữ liệu lỗi.</w:t>
-      </w:r>
-    </w:p>
-    <w:p>
-      <w:pPr>
-        <w:numPr>
-          <w:ilvl w:val="0"/>
-          <w:numId w:val="2"/>
-        </w:numPr>
-        <w:spacing w:after="240" w:lineRule="auto"/>
-        <w:ind w:left="720" w:hanging="360"/>
-        <w:rPr/>
-      </w:pPr>
-      <w:r>
-        <w:rPr>
-          <w:rtl w:val="0"/>
-        </w:rPr>
-        <w:t xml:space="preserve">Cấu hình tối ưu: Được đánh Composite Index (Index liên hợp) trên các cụm khóa </w:t>
-      </w:r>
-      <w:r>
-        <w:rPr>
+        <w:spacing w:after="240" w:before="0" w:beforeAutospacing="0" w:lineRule="auto"/>
+        <w:ind w:left="720" w:hanging="360"/>
+      </w:pPr>
+      <w:r>
+        <w:rPr>
+          <w:rtl w:val="0"/>
+        </w:rPr>
+        <w:t xml:space="preserve">Cấu hình tối ưu (Indexing): Được trang bị Composite Index (Index liên hợp) trên cụm </w:t>
+      </w:r>
+      <w:r>
+        <w:rPr>
+          <w:rFonts w:ascii="Roboto Mono" w:cs="Roboto Mono" w:eastAsia="Roboto Mono" w:hAnsi="Roboto Mono"/>
           <w:color w:val="188038"/>
           <w:rtl w:val="0"/>
         </w:rPr>
@@ -417,6 +479,7 @@
       </w:r>
       <w:r>
         <w:rPr>
+          <w:rFonts w:ascii="Roboto Mono" w:cs="Roboto Mono" w:eastAsia="Roboto Mono" w:hAnsi="Roboto Mono"/>
           <w:color w:val="188038"/>
           <w:rtl w:val="0"/>
         </w:rPr>
@@ -426,7 +489,7 @@
         <w:rPr>
           <w:rtl w:val="0"/>
         </w:rPr>
-        <w:t xml:space="preserve">. Kỹ thuật này giúp Tableau thực hiện các thao tác lọc trạm, lọc ngày với tốc độ tức thời (quét mục lục thay vì quét toàn bộ bảng).</w:t>
+        <w:t xml:space="preserve">. Kỹ thuật này giúp các thao tác lọc trạm hoặc lọc theo ngày trên Dashboard diễn ra gần như tức thời (Index-Only Scan).</w:t>
       </w:r>
     </w:p>
     <w:p>
@@ -434,7 +497,8 @@
         <w:pStyle w:val="Heading3"/>
         <w:keepNext w:val="0"/>
         <w:keepLines w:val="0"/>
-        <w:spacing w:before="0" w:lineRule="auto"/>
+        <w:spacing w:before="280" w:lineRule="auto"/>
+        <w:ind w:left="720" w:hanging="360"/>
         <w:rPr>
           <w:b w:val="1"/>
           <w:bCs w:val="1"/>
@@ -443,7 +507,7 @@
           <w:szCs w:val="26"/>
         </w:rPr>
       </w:pPr>
-      <w:bookmarkStart w:colFirst="0" w:colLast="0" w:name="_v0yepas14bfd" w:id="4"/>
+      <w:bookmarkStart w:colFirst="0" w:colLast="0" w:name="_ojmmc21cq3ia" w:id="4"/>
       <w:bookmarkEnd w:id="4"/>
       <w:r>
         <w:rPr>
@@ -459,17 +523,18 @@
     </w:p>
     <w:p>
       <w:pPr>
-        <w:spacing w:after="240" w:lineRule="auto"/>
+        <w:spacing w:after="240" w:before="240" w:lineRule="auto"/>
         <w:rPr/>
       </w:pPr>
       <w:r>
         <w:rPr>
           <w:rtl w:val="0"/>
         </w:rPr>
-        <w:t xml:space="preserve">Thay vì dùng View ảo, pipeline sao chép cứng dữ liệu Dimension từ schema </w:t>
-      </w:r>
-      <w:r>
-        <w:rPr>
+        <w:t xml:space="preserve">Pipeline sao chép cứng dữ liệu Dimension từ schema </w:t>
+      </w:r>
+      <w:r>
+        <w:rPr>
+          <w:rFonts w:ascii="Roboto Mono" w:cs="Roboto Mono" w:eastAsia="Roboto Mono" w:hAnsi="Roboto Mono"/>
           <w:color w:val="188038"/>
           <w:rtl w:val="0"/>
         </w:rPr>
@@ -479,10 +544,11 @@
         <w:rPr>
           <w:rtl w:val="0"/>
         </w:rPr>
-        <w:t xml:space="preserve"> sang schema </w:t>
-      </w:r>
-      <w:r>
-        <w:rPr>
+        <w:t xml:space="preserve"> sang </w:t>
+      </w:r>
+      <w:r>
+        <w:rPr>
+          <w:rFonts w:ascii="Roboto Mono" w:cs="Roboto Mono" w:eastAsia="Roboto Mono" w:hAnsi="Roboto Mono"/>
           <w:color w:val="188038"/>
           <w:rtl w:val="0"/>
         </w:rPr>
@@ -492,21 +558,21 @@
         <w:rPr>
           <w:rtl w:val="0"/>
         </w:rPr>
-        <w:t xml:space="preserve"> để Tableau truy vấn trực tiếp trên ổ cứng nội bộ, tăng tốc độ phản hồi.</w:t>
+        <w:t xml:space="preserve"> để hệ thống BI truy xuất nội bộ, không phải đi đường vòng.</w:t>
       </w:r>
     </w:p>
     <w:p>
       <w:pPr>
         <w:numPr>
           <w:ilvl w:val="0"/>
-          <w:numId w:val="1"/>
+          <w:numId w:val="2"/>
         </w:numPr>
-        <w:spacing w:after="0" w:afterAutospacing="0" w:lineRule="auto"/>
-        <w:ind w:left="720" w:hanging="360"/>
-        <w:rPr/>
-      </w:pPr>
-      <w:r>
-        <w:rPr>
+        <w:spacing w:after="0" w:afterAutospacing="0" w:before="240" w:lineRule="auto"/>
+        <w:ind w:left="720" w:hanging="360"/>
+      </w:pPr>
+      <w:r>
+        <w:rPr>
+          <w:rFonts w:ascii="Roboto Mono" w:cs="Roboto Mono" w:eastAsia="Roboto Mono" w:hAnsi="Roboto Mono"/>
           <w:color w:val="188038"/>
           <w:rtl w:val="0"/>
         </w:rPr>
@@ -516,10 +582,11 @@
         <w:rPr>
           <w:rtl w:val="0"/>
         </w:rPr>
-        <w:t xml:space="preserve"> (Chiều Trạm điện): Lưu trữ thông tin phần cứng của từng trạm (tên campus, công suất kw, số lượng tấm pin, loại inverter...). Khóa chính: </w:t>
-      </w:r>
-      <w:r>
-        <w:rPr>
+        <w:t xml:space="preserve">: Thông tin phần cứng trạm (công suất, tấm pin, inverter). Khóa chính: </w:t>
+      </w:r>
+      <w:r>
+        <w:rPr>
+          <w:rFonts w:ascii="Roboto Mono" w:cs="Roboto Mono" w:eastAsia="Roboto Mono" w:hAnsi="Roboto Mono"/>
           <w:color w:val="188038"/>
           <w:rtl w:val="0"/>
         </w:rPr>
@@ -536,14 +603,14 @@
       <w:pPr>
         <w:numPr>
           <w:ilvl w:val="0"/>
-          <w:numId w:val="1"/>
+          <w:numId w:val="2"/>
         </w:numPr>
-        <w:spacing w:after="0" w:afterAutospacing="0" w:lineRule="auto"/>
-        <w:ind w:left="720" w:hanging="360"/>
-        <w:rPr/>
-      </w:pPr>
-      <w:r>
-        <w:rPr>
+        <w:spacing w:after="0" w:afterAutospacing="0" w:before="0" w:beforeAutospacing="0" w:lineRule="auto"/>
+        <w:ind w:left="720" w:hanging="360"/>
+      </w:pPr>
+      <w:r>
+        <w:rPr>
+          <w:rFonts w:ascii="Roboto Mono" w:cs="Roboto Mono" w:eastAsia="Roboto Mono" w:hAnsi="Roboto Mono"/>
           <w:color w:val="188038"/>
           <w:rtl w:val="0"/>
         </w:rPr>
@@ -553,10 +620,11 @@
         <w:rPr>
           <w:rtl w:val="0"/>
         </w:rPr>
-        <w:t xml:space="preserve"> (Chiều Địa lý): Lưu trữ tọa độ vĩ độ, kinh độ và tên khu vực của trạm. Khóa chính: </w:t>
-      </w:r>
-      <w:r>
-        <w:rPr>
+        <w:t xml:space="preserve">: Tọa độ địa lý (kinh/vĩ độ, tên khu vực). Khóa chính: </w:t>
+      </w:r>
+      <w:r>
+        <w:rPr>
+          <w:rFonts w:ascii="Roboto Mono" w:cs="Roboto Mono" w:eastAsia="Roboto Mono" w:hAnsi="Roboto Mono"/>
           <w:color w:val="188038"/>
           <w:rtl w:val="0"/>
         </w:rPr>
@@ -573,14 +641,14 @@
       <w:pPr>
         <w:numPr>
           <w:ilvl w:val="0"/>
-          <w:numId w:val="1"/>
+          <w:numId w:val="2"/>
         </w:numPr>
-        <w:spacing w:after="0" w:afterAutospacing="0" w:lineRule="auto"/>
-        <w:ind w:left="720" w:hanging="360"/>
-        <w:rPr/>
-      </w:pPr>
-      <w:r>
-        <w:rPr>
+        <w:spacing w:after="0" w:afterAutospacing="0" w:before="0" w:beforeAutospacing="0" w:lineRule="auto"/>
+        <w:ind w:left="720" w:hanging="360"/>
+      </w:pPr>
+      <w:r>
+        <w:rPr>
+          <w:rFonts w:ascii="Roboto Mono" w:cs="Roboto Mono" w:eastAsia="Roboto Mono" w:hAnsi="Roboto Mono"/>
           <w:color w:val="188038"/>
           <w:rtl w:val="0"/>
         </w:rPr>
@@ -590,71 +658,46 @@
         <w:rPr>
           <w:rtl w:val="0"/>
         </w:rPr>
-        <w:t xml:space="preserve"> (Chiều Ngày tháng): Phân rã mốc thời gian thành các thành phần Ngày, Tháng, Năm để hỗ trợ Tableau cắt lớp dữ liệu theo chu kỳ thời gian. Khóa chính: </w:t>
-      </w:r>
-      <w:r>
-        <w:rPr>
-          <w:color w:val="188038"/>
-          <w:rtl w:val="0"/>
-        </w:rPr>
-        <w:t xml:space="preserve">date_id</w:t>
-      </w:r>
-      <w:r>
-        <w:rPr>
-          <w:rtl w:val="0"/>
-        </w:rPr>
-        <w:t xml:space="preserve">.</w:t>
+        <w:t xml:space="preserve"> &amp; </w:t>
+      </w:r>
+      <w:r>
+        <w:rPr>
+          <w:rFonts w:ascii="Roboto Mono" w:cs="Roboto Mono" w:eastAsia="Roboto Mono" w:hAnsi="Roboto Mono"/>
+          <w:color w:val="188038"/>
+          <w:rtl w:val="0"/>
+        </w:rPr>
+        <w:t xml:space="preserve">dim_weather_type</w:t>
+      </w:r>
+      <w:r>
+        <w:rPr>
+          <w:rtl w:val="0"/>
+        </w:rPr>
+        <w:t xml:space="preserve">: Các chiều thời gian và trạng thái khí tượng.</w:t>
       </w:r>
     </w:p>
     <w:p>
       <w:pPr>
         <w:numPr>
           <w:ilvl w:val="0"/>
-          <w:numId w:val="1"/>
+          <w:numId w:val="2"/>
         </w:numPr>
-        <w:spacing w:after="240" w:lineRule="auto"/>
+        <w:spacing w:after="240" w:before="0" w:beforeAutospacing="0" w:lineRule="auto"/>
         <w:ind w:left="720" w:hanging="360"/>
         <w:rPr/>
       </w:pPr>
       <w:r>
-        <w:rPr>
-          <w:color w:val="188038"/>
-          <w:rtl w:val="0"/>
-        </w:rPr>
-        <w:t xml:space="preserve">dim_weather_type</w:t>
-      </w:r>
-      <w:r>
-        <w:rPr>
-          <w:rtl w:val="0"/>
-        </w:rPr>
-        <w:t xml:space="preserve"> (Chiều Phân loại thời tiết): Lưu trữ mã thời tiết và mô tả trạng thái khí tượng phục vụ việc trực quan hóa trực quan. Khóa chính: </w:t>
-      </w:r>
-      <w:r>
-        <w:rPr>
-          <w:color w:val="188038"/>
-          <w:rtl w:val="0"/>
-        </w:rPr>
-        <w:t xml:space="preserve">weather_type_id</w:t>
-      </w:r>
-      <w:r>
-        <w:rPr>
-          <w:rtl w:val="0"/>
-        </w:rPr>
-        <w:t xml:space="preserve">.</w:t>
-      </w:r>
-    </w:p>
-    <w:p>
-      <w:pPr>
-        <w:spacing w:after="240" w:lineRule="auto"/>
         <w:rPr>
           <w:i w:val="1"/>
           <w:iCs w:val="1"/>
-        </w:rPr>
-      </w:pPr>
-      <w:r>
-        <w:rPr>
-          <w:rtl w:val="0"/>
-        </w:rPr>
+          <w:rtl w:val="0"/>
+        </w:rPr>
+        <w:t xml:space="preserve">Đặc biệt:</w:t>
+      </w:r>
+      <w:r>
+        <w:rPr>
+          <w:rtl w:val="0"/>
+        </w:rPr>
+        <w:t xml:space="preserve"> Các bảng Dimension được ràng buộc với bảng Fact trung tâm thông qua các Khóa ngoại (Foreign Keys), tạo thành một sơ đồ thực thể (ERD) hoàn hảo, bảo vệ tính toàn vẹn dữ liệu.</w:t>
       </w:r>
     </w:p>
     <w:p>
@@ -662,8 +705,10 @@
         <w:pStyle w:val="Heading2"/>
         <w:keepNext w:val="0"/>
         <w:keepLines w:val="0"/>
-        <w:spacing w:after="80" w:before="0" w:lineRule="auto"/>
-        <w:rPr>
+        <w:spacing w:after="80" w:lineRule="auto"/>
+        <w:ind w:left="720" w:hanging="360"/>
+        <w:rPr>
+          <w:rFonts w:ascii="Roboto Mono" w:cs="Roboto Mono" w:eastAsia="Roboto Mono" w:hAnsi="Roboto Mono"/>
           <w:b w:val="1"/>
           <w:bCs w:val="1"/>
           <w:color w:val="188038"/>
@@ -671,7 +716,7 @@
           <w:szCs w:val="34"/>
         </w:rPr>
       </w:pPr>
-      <w:bookmarkStart w:colFirst="0" w:colLast="0" w:name="_5nz8ie2ghxum" w:id="5"/>
+      <w:bookmarkStart w:colFirst="0" w:colLast="0" w:name="_n6sx3mqfiz4c" w:id="5"/>
       <w:bookmarkEnd w:id="5"/>
       <w:r>
         <w:rPr>
@@ -681,10 +726,11 @@
           <w:szCs w:val="34"/>
           <w:rtl w:val="0"/>
         </w:rPr>
-        <w:t xml:space="preserve">III. CẤU TRÚC VÀ CÔNG DỤNG TRONG </w:t>
-      </w:r>
-      <w:r>
-        <w:rPr>
+        <w:t xml:space="preserve">III. PHÂN HỆ HỌC MÁY: </w:t>
+      </w:r>
+      <w:r>
+        <w:rPr>
+          <w:rFonts w:ascii="Roboto Mono" w:cs="Roboto Mono" w:eastAsia="Roboto Mono" w:hAnsi="Roboto Mono"/>
           <w:b w:val="1"/>
           <w:bCs w:val="1"/>
           <w:color w:val="188038"/>
@@ -697,7 +743,7 @@
     </w:p>
     <w:p>
       <w:pPr>
-        <w:spacing w:after="240" w:lineRule="auto"/>
+        <w:spacing w:after="240" w:before="240" w:lineRule="auto"/>
         <w:rPr/>
       </w:pPr>
       <w:r>
@@ -708,6 +754,7 @@
       </w:r>
       <w:r>
         <w:rPr>
+          <w:rFonts w:ascii="Roboto Mono" w:cs="Roboto Mono" w:eastAsia="Roboto Mono" w:hAnsi="Roboto Mono"/>
           <w:color w:val="188038"/>
           <w:rtl w:val="0"/>
         </w:rPr>
@@ -717,7 +764,7 @@
         <w:rPr>
           <w:rtl w:val="0"/>
         </w:rPr>
-        <w:t xml:space="preserve"> phục vụ riêng cho các thuật toán Học máy (Machine Learning), được tách biệt hoàn toàn với phân hệ báo cáo để tránh xung đột tài nguyên.</w:t>
+        <w:t xml:space="preserve"> phục vụ riêng cho công tác huấn luyện thuật toán AI, được tách biệt với phân hệ BI để tránh xung đột tài nguyên.</w:t>
       </w:r>
     </w:p>
     <w:p>
@@ -725,8 +772,10 @@
         <w:pStyle w:val="Heading3"/>
         <w:keepNext w:val="0"/>
         <w:keepLines w:val="0"/>
-        <w:spacing w:before="0" w:lineRule="auto"/>
-        <w:rPr>
+        <w:spacing w:before="280" w:lineRule="auto"/>
+        <w:ind w:left="720" w:hanging="360"/>
+        <w:rPr>
+          <w:rFonts w:ascii="Roboto Mono" w:cs="Roboto Mono" w:eastAsia="Roboto Mono" w:hAnsi="Roboto Mono"/>
           <w:b w:val="1"/>
           <w:bCs w:val="1"/>
           <w:color w:val="188038"/>
@@ -734,7 +783,7 @@
           <w:szCs w:val="26"/>
         </w:rPr>
       </w:pPr>
-      <w:bookmarkStart w:colFirst="0" w:colLast="0" w:name="_dgnxdvdik1t6" w:id="6"/>
+      <w:bookmarkStart w:colFirst="0" w:colLast="0" w:name="_cgx15qt5ycsv" w:id="6"/>
       <w:bookmarkEnd w:id="6"/>
       <w:r>
         <w:rPr>
@@ -745,10 +794,11 @@
           <w:szCs w:val="26"/>
           <w:rtl w:val="0"/>
         </w:rPr>
-        <w:t xml:space="preserve">1. Bảng phẳng tính năng: </w:t>
-      </w:r>
-      <w:r>
-        <w:rPr>
+        <w:t xml:space="preserve">1. Bảng phẳng Đặc trưng: </w:t>
+      </w:r>
+      <w:r>
+        <w:rPr>
+          <w:rFonts w:ascii="Roboto Mono" w:cs="Roboto Mono" w:eastAsia="Roboto Mono" w:hAnsi="Roboto Mono"/>
           <w:b w:val="1"/>
           <w:bCs w:val="1"/>
           <w:color w:val="188038"/>
@@ -763,9 +813,9 @@
       <w:pPr>
         <w:numPr>
           <w:ilvl w:val="0"/>
-          <w:numId w:val="4"/>
+          <w:numId w:val="1"/>
         </w:numPr>
-        <w:spacing w:after="0" w:afterAutospacing="0" w:lineRule="auto"/>
+        <w:spacing w:after="0" w:afterAutospacing="0" w:before="240" w:lineRule="auto"/>
         <w:ind w:left="720" w:hanging="360"/>
         <w:rPr/>
       </w:pPr>
@@ -773,27 +823,27 @@
         <w:rPr>
           <w:rtl w:val="0"/>
         </w:rPr>
-        <w:t xml:space="preserve">Bản chất: Bảng phẳng duỗi thẳng cấu trúc (Flat Feature Table / Denormalized Table).</w:t>
+        <w:t xml:space="preserve">Bản chất: Bảng phẳng duỗi thẳng cấu trúc (Flat Feature Table / Denormalized).</w:t>
       </w:r>
     </w:p>
     <w:p>
       <w:pPr>
         <w:numPr>
           <w:ilvl w:val="0"/>
-          <w:numId w:val="4"/>
+          <w:numId w:val="1"/>
         </w:numPr>
-        <w:spacing w:after="0" w:afterAutospacing="0" w:lineRule="auto"/>
-        <w:ind w:left="720" w:hanging="360"/>
-        <w:rPr/>
-      </w:pPr>
-      <w:r>
-        <w:rPr>
-          <w:rtl w:val="0"/>
-        </w:rPr>
-        <w:t xml:space="preserve">Đặc trưng thiết kế: Bảng này loại bỏ hoàn toàn tất cả các cột ID/Key định danh vô nghĩa đối với toán học (như </w:t>
-      </w:r>
-      <w:r>
-        <w:rPr>
+        <w:spacing w:after="0" w:afterAutospacing="0" w:before="0" w:beforeAutospacing="0" w:lineRule="auto"/>
+        <w:ind w:left="720" w:hanging="360"/>
+      </w:pPr>
+      <w:r>
+        <w:rPr>
+          <w:rtl w:val="0"/>
+        </w:rPr>
+        <w:t xml:space="preserve">Đặc trưng thiết kế: * Loại bỏ Định danh: Lược bỏ hoàn toàn các cột ID (</w:t>
+      </w:r>
+      <w:r>
+        <w:rPr>
+          <w:rFonts w:ascii="Roboto Mono" w:cs="Roboto Mono" w:eastAsia="Roboto Mono" w:hAnsi="Roboto Mono"/>
           <w:color w:val="188038"/>
           <w:rtl w:val="0"/>
         </w:rPr>
@@ -807,6 +857,7 @@
       </w:r>
       <w:r>
         <w:rPr>
+          <w:rFonts w:ascii="Roboto Mono" w:cs="Roboto Mono" w:eastAsia="Roboto Mono" w:hAnsi="Roboto Mono"/>
           <w:color w:val="188038"/>
           <w:rtl w:val="0"/>
         </w:rPr>
@@ -816,27 +867,45 @@
         <w:rPr>
           <w:rtl w:val="0"/>
         </w:rPr>
+        <w:t xml:space="preserve">) để ngăn chặn thuật toán rơi vào tình trạng Overfitting (Học vẹt mã ID).</w:t>
+      </w:r>
+    </w:p>
+    <w:p>
+      <w:pPr>
+        <w:numPr>
+          <w:ilvl w:val="1"/>
+          <w:numId w:val="1"/>
+        </w:numPr>
+        <w:spacing w:after="0" w:afterAutospacing="0" w:before="0" w:beforeAutospacing="0" w:lineRule="auto"/>
+        <w:ind w:left="1440" w:hanging="360"/>
+      </w:pPr>
+      <w:r>
+        <w:rPr>
+          <w:rtl w:val="0"/>
+        </w:rPr>
+        <w:t xml:space="preserve">Bóc tách thời gian: Chuyển đổi ID thời gian thành các con số toán học có ý nghĩa chu kỳ (</w:t>
+      </w:r>
+      <w:r>
+        <w:rPr>
+          <w:rFonts w:ascii="Roboto Mono" w:cs="Roboto Mono" w:eastAsia="Roboto Mono" w:hAnsi="Roboto Mono"/>
+          <w:color w:val="188038"/>
+          <w:rtl w:val="0"/>
+        </w:rPr>
+        <w:t xml:space="preserve">hour</w:t>
+      </w:r>
+      <w:r>
+        <w:rPr>
+          <w:rtl w:val="0"/>
+        </w:rPr>
         <w:t xml:space="preserve">, </w:t>
       </w:r>
       <w:r>
         <w:rPr>
-          <w:color w:val="188038"/>
-          <w:rtl w:val="0"/>
-        </w:rPr>
-        <w:t xml:space="preserve">date_id</w:t>
-      </w:r>
-      <w:r>
-        <w:rPr>
-          <w:rtl w:val="0"/>
-        </w:rPr>
-        <w:t xml:space="preserve">). Dữ liệu thời gian được bóc tách thẳng thành các giá trị số thực tế như cột </w:t>
-      </w:r>
-      <w:r>
-        <w:rPr>
-          <w:color w:val="188038"/>
-          <w:rtl w:val="0"/>
-        </w:rPr>
-        <w:t xml:space="preserve">hour</w:t>
+          <w:rFonts w:ascii="Roboto Mono" w:cs="Roboto Mono" w:eastAsia="Roboto Mono" w:hAnsi="Roboto Mono"/>
+          <w:color w:val="188038"/>
+          <w:rtl w:val="0"/>
+        </w:rPr>
+        <w:t xml:space="preserve">day</w:t>
       </w:r>
       <w:r>
         <w:rPr>
@@ -846,19 +915,7 @@
       </w:r>
       <w:r>
         <w:rPr>
-          <w:color w:val="188038"/>
-          <w:rtl w:val="0"/>
-        </w:rPr>
-        <w:t xml:space="preserve">day</w:t>
-      </w:r>
-      <w:r>
-        <w:rPr>
-          <w:rtl w:val="0"/>
-        </w:rPr>
-        <w:t xml:space="preserve">, </w:t>
-      </w:r>
-      <w:r>
-        <w:rPr>
+          <w:rFonts w:ascii="Roboto Mono" w:cs="Roboto Mono" w:eastAsia="Roboto Mono" w:hAnsi="Roboto Mono"/>
           <w:color w:val="188038"/>
           <w:rtl w:val="0"/>
         </w:rPr>
@@ -868,67 +925,63 @@
         <w:rPr>
           <w:rtl w:val="0"/>
         </w:rPr>
-        <w:t xml:space="preserve">, </w:t>
-      </w:r>
-      <w:r>
-        <w:rPr>
-          <w:color w:val="188038"/>
-          <w:rtl w:val="0"/>
-        </w:rPr>
-        <w:t xml:space="preserve">year</w:t>
-      </w:r>
-      <w:r>
-        <w:rPr>
-          <w:rtl w:val="0"/>
-        </w:rPr>
-        <w:t xml:space="preserve">.</w:t>
+        <w:t xml:space="preserve">).</w:t>
       </w:r>
     </w:p>
     <w:p>
       <w:pPr>
         <w:numPr>
           <w:ilvl w:val="0"/>
-          <w:numId w:val="4"/>
+          <w:numId w:val="1"/>
         </w:numPr>
-        <w:spacing w:after="0" w:afterAutospacing="0" w:lineRule="auto"/>
-        <w:ind w:left="720" w:hanging="360"/>
+        <w:spacing w:after="240" w:before="0" w:beforeAutospacing="0" w:lineRule="auto"/>
+        <w:ind w:left="720" w:hanging="360"/>
+      </w:pPr>
+      <w:r>
+        <w:rPr>
+          <w:rtl w:val="0"/>
+        </w:rPr>
+        <w:t xml:space="preserve">Cơ chế xử lý Cờ nhiễu (Outlier Handling): Khác với BI (xóa bỏ dữ liệu nhiễu), hệ thống ML lấy trực tiếp cờ </w:t>
+      </w:r>
+      <w:r>
+        <w:rPr>
+          <w:rFonts w:ascii="Roboto Mono" w:cs="Roboto Mono" w:eastAsia="Roboto Mono" w:hAnsi="Roboto Mono"/>
+          <w:color w:val="188038"/>
+          <w:rtl w:val="0"/>
+        </w:rPr>
+        <w:t xml:space="preserve">rolling_outlier_flag</w:t>
+      </w:r>
+      <w:r>
+        <w:rPr>
+          <w:rtl w:val="0"/>
+        </w:rPr>
+        <w:t xml:space="preserve"> từ bảng Fact để tạo thành Feature </w:t>
+      </w:r>
+      <w:r>
+        <w:rPr>
+          <w:rFonts w:ascii="Roboto Mono" w:cs="Roboto Mono" w:eastAsia="Roboto Mono" w:hAnsi="Roboto Mono"/>
+          <w:color w:val="188038"/>
+          <w:rtl w:val="0"/>
+        </w:rPr>
+        <w:t xml:space="preserve">is_outlier</w:t>
+      </w:r>
+      <w:r>
+        <w:rPr>
+          <w:rtl w:val="0"/>
+        </w:rPr>
+        <w:t xml:space="preserve"> (True/False). Thiết kế này trao quyền cho đội Data Science: Họ có thể lọc bỏ trên Pandas, hoặc sử dụng chính dữ liệu này để huấn luyện mô hình dự đoán lỗi cảm biến.</w:t>
+      </w:r>
+    </w:p>
+    <w:p>
+      <w:pPr>
+        <w:spacing w:after="240" w:lineRule="auto"/>
+        <w:ind w:left="720" w:firstLine="0"/>
         <w:rPr/>
       </w:pPr>
       <w:r>
         <w:rPr>
           <w:rtl w:val="0"/>
         </w:rPr>
-        <w:t xml:space="preserve">Công dụng: Cung cấp "thức ăn" sạch cho mô hình huấn luyện AI (Python/Pandas/Jupyter Notebook). Việc xóa ID giúp ngăn chặn hiện tượng Overfitting (Học vẹt) của mô hình, ép thuật toán phải tìm quy luật dựa trên dữ liệu thực tế (bức xạ, nhiệt độ, mốc giờ) thay vì ghi nhớ mã ID của trạm.</w:t>
-      </w:r>
-    </w:p>
-    <w:p>
-      <w:pPr>
-        <w:numPr>
-          <w:ilvl w:val="0"/>
-          <w:numId w:val="4"/>
-        </w:numPr>
-        <w:spacing w:after="240" w:lineRule="auto"/>
-        <w:ind w:left="720" w:hanging="360"/>
-        <w:rPr/>
-      </w:pPr>
-      <w:r>
-        <w:rPr>
-          <w:rtl w:val="0"/>
-        </w:rPr>
-        <w:t xml:space="preserve">Cơ chế giữ cờ nhiễu: Khác với BI (xóa thẳng tay dòng nhiễu), bảng ML giữ lại cột </w:t>
-      </w:r>
-      <w:r>
-        <w:rPr>
-          <w:color w:val="188038"/>
-          <w:rtl w:val="0"/>
-        </w:rPr>
-        <w:t xml:space="preserve">is_outlier</w:t>
-      </w:r>
-      <w:r>
-        <w:rPr>
-          <w:rtl w:val="0"/>
-        </w:rPr>
-        <w:t xml:space="preserve"> (True/False). Điều này cho phép đội ngũ làm AI có hai lựa chọn linh hoạt: Hoặc lọc bỏ dữ liệu bẩn trên Pandas trước khi train, hoặc giữ lại để huấn luyện mô hình nhận diện và dự đoán các tình huống cảm biến bị lỗi lỗi trong thực tế.</w:t>
       </w:r>
     </w:p>
     <w:p>
@@ -962,7 +1015,6 @@
         <w:ind w:left="720" w:hanging="360"/>
       </w:pPr>
       <w:rPr>
-        <w:rFonts w:ascii="Arial" w:cs="Arial" w:eastAsia="Arial" w:hAnsi="Arial"/>
         <w:u w:val="none"/>
       </w:rPr>
     </w:lvl>
@@ -1073,7 +1125,6 @@
         <w:ind w:left="720" w:hanging="360"/>
       </w:pPr>
       <w:rPr>
-        <w:rFonts w:ascii="Arial" w:cs="Arial" w:eastAsia="Arial" w:hAnsi="Arial"/>
         <w:u w:val="none"/>
       </w:rPr>
     </w:lvl>
@@ -1184,14 +1235,13 @@
         <w:ind w:left="720" w:hanging="360"/>
       </w:pPr>
       <w:rPr>
-        <w:rFonts w:ascii="Arial" w:cs="Arial" w:eastAsia="Arial" w:hAnsi="Arial"/>
         <w:u w:val="none"/>
       </w:rPr>
     </w:lvl>
     <w:lvl w:ilvl="1">
       <w:start w:val="1"/>
-      <w:numFmt w:val="bullet"/>
-      <w:lvlText w:val="○"/>
+      <w:numFmt w:val="decimal"/>
+      <w:lvlText w:val="%2."/>
       <w:lvlJc w:val="left"/>
       <w:pPr>
         <w:ind w:left="1440" w:hanging="360"/>
@@ -1295,7 +1345,6 @@
         <w:ind w:left="720" w:hanging="360"/>
       </w:pPr>
       <w:rPr>
-        <w:rFonts w:ascii="Arial" w:cs="Arial" w:eastAsia="Arial" w:hAnsi="Arial"/>
         <w:u w:val="none"/>
       </w:rPr>
     </w:lvl>

</xml_diff>